<commit_message>
Amend accessibility spec to v5.1: non-modal reference-panel contract (Sections 3, 10), provisional tiered save model (Section 6), always-visible guided-practice blocks (Section 15)
Co-Authored-By: Claude Opus 4.8 (1M context) <noreply@anthropic.com>
</commit_message>
<xml_diff>
--- a/Docs/Accessibility & Inclusion Plan.docx
+++ b/Docs/Accessibility & Inclusion Plan.docx
@@ -75,7 +75,26 @@
           <w:color w:val="666666"/>
           <w:rtl w:val="0"/>
         </w:rPr>
-        <w:t xml:space="preserve">Version 5.0  |  Final Build, QA, and Deployment Standard  |  AccessPoint Output</w:t>
+        <w:t xml:space="preserve">Version 5.1  |  Final Build, QA, and Deployment Standard  |  AccessPoint Output</w:t>
+      </w:r>
+    </w:p>
+    <w:p>
+      <w:pPr>
+        <w:spacing w:before="80" w:lineRule="auto"/>
+        <w:rPr>
+          <w:i w:val="1"/>
+          <w:iCs w:val="1"/>
+          <w:color w:val="666666"/>
+        </w:rPr>
+      </w:pPr>
+      <w:r>
+        <w:rPr>
+          <w:i w:val="1"/>
+          <w:iCs w:val="1"/>
+          <w:color w:val="666666"/>
+          <w:rtl w:val="0"/>
+        </w:rPr>
+        <w:t xml:space="preserve">v5.1 changelog (2026-06-27): Support panels redefined as non-modal reference panels (Sections 3 and 10). Save and recovery contract tiered by input type (Section 6); this tiering is PROVISIONAL, pending spec-owner confirmation. Guided Practice success criteria and expected evidence updated to always-visible, not collapsible (Section 15).</w:t>
       </w:r>
     </w:p>
     <w:p>
@@ -4403,7 +4422,7 @@
                 <w:szCs w:val="17"/>
                 <w:rtl w:val="0"/>
               </w:rPr>
-              <w:t xml:space="preserve">Dialogs and Drawers</w:t>
+              <w:t xml:space="preserve">Support / Reference Panels</w:t>
             </w:r>
           </w:p>
         </w:tc>
@@ -4439,7 +4458,7 @@
                 <w:szCs w:val="17"/>
                 <w:rtl w:val="0"/>
               </w:rPr>
-              <w:t xml:space="preserve">role='dialog', aria-modal='true'</w:t>
+              <w:t xml:space="preserve">aria-expanded + aria-controls on trigger; accessible name on panel</w:t>
             </w:r>
           </w:p>
         </w:tc>
@@ -4475,7 +4494,7 @@
                 <w:szCs w:val="17"/>
                 <w:rtl w:val="0"/>
               </w:rPr>
-              <w:t xml:space="preserve">Focus trapped inside</w:t>
+              <w:t xml:space="preserve">Non-modal. Focus NOT trapped. Escape closes; focus returns to trigger; single-panel-open enforced.</w:t>
             </w:r>
           </w:p>
         </w:tc>
@@ -6020,7 +6039,7 @@
                 <w:color w:val="1a1a1a"/>
                 <w:rtl w:val="0"/>
               </w:rPr>
-              <w:t xml:space="preserve">Required on all learner-input screens: autosave every 30 seconds, autosave on field exit, manual Save button, save timestamp. Autosave must complete in under 2 seconds.</w:t>
+              <w:t xml:space="preserve">Status (v5.1, 2026-06-27): The tiered save model below is PROVISIONAL, pending spec-owner confirmation. The prior v5.0 text required the full contract (autosave every 30 seconds, autosave on field exit, manual Save button, save timestamp; autosave under 2 seconds) on all learner-input screens.</w:t>
             </w:r>
           </w:p>
         </w:tc>
@@ -6036,6 +6055,110 @@
           <w:rtl w:val="0"/>
         </w:rPr>
         <w:t xml:space="preserve"> </w:t>
+      </w:r>
+    </w:p>
+    <w:p>
+      <w:pPr>
+        <w:spacing w:after="40" w:before="80" w:lineRule="auto"/>
+        <w:rPr>
+          <w:color w:val="1a1a1a"/>
+        </w:rPr>
+      </w:pPr>
+      <w:r>
+        <w:rPr>
+          <w:b w:val="1"/>
+          <w:bCs w:val="1"/>
+          <w:color w:val="1a1a1a"/>
+          <w:rtl w:val="0"/>
+        </w:rPr>
+        <w:t xml:space="preserve">Save requirements scale by input type (risk of work loss):</w:t>
+      </w:r>
+    </w:p>
+    <w:p>
+      <w:pPr>
+        <w:spacing w:after="40" w:before="40" w:lineRule="auto"/>
+        <w:rPr>
+          <w:color w:val="1a1a1a"/>
+        </w:rPr>
+      </w:pPr>
+      <w:r>
+        <w:rPr>
+          <w:b w:val="1"/>
+          <w:bCs w:val="1"/>
+          <w:color w:val="1a1a1a"/>
+          <w:rtl w:val="0"/>
+        </w:rPr>
+        <w:t xml:space="preserve">Tier 1, substantial authored text (artifacts, reflections, long-text fields): </w:t>
+      </w:r>
+      <w:r>
+        <w:rPr>
+          <w:color w:val="1a1a1a"/>
+          <w:rtl w:val="0"/>
+        </w:rPr>
+        <w:t xml:space="preserve">full contract. Autosave every 30 seconds, autosave on field exit, manual Save button, save timestamp, save-failure recovery actions, and the save-state announcements below. Autosave must complete in under 2 seconds.</w:t>
+      </w:r>
+    </w:p>
+    <w:p>
+      <w:pPr>
+        <w:spacing w:after="40" w:before="40" w:lineRule="auto"/>
+        <w:rPr>
+          <w:color w:val="1a1a1a"/>
+        </w:rPr>
+      </w:pPr>
+      <w:r>
+        <w:rPr>
+          <w:b w:val="1"/>
+          <w:bCs w:val="1"/>
+          <w:color w:val="1a1a1a"/>
+          <w:rtl w:val="0"/>
+        </w:rPr>
+        <w:t xml:space="preserve">Tier 2, structured input (decision points, guided-practice fields, short single-line responses): </w:t>
+      </w:r>
+      <w:r>
+        <w:rPr>
+          <w:color w:val="1a1a1a"/>
+          <w:rtl w:val="0"/>
+        </w:rPr>
+        <w:t xml:space="preserve">autosave on field exit, persistence, and a visible save indicator. Download Draft and Copy Response recovery not required.</w:t>
+      </w:r>
+    </w:p>
+    <w:p>
+      <w:pPr>
+        <w:spacing w:after="40" w:before="40" w:lineRule="auto"/>
+        <w:rPr>
+          <w:color w:val="1a1a1a"/>
+        </w:rPr>
+      </w:pPr>
+      <w:r>
+        <w:rPr>
+          <w:b w:val="1"/>
+          <w:bCs w:val="1"/>
+          <w:color w:val="1a1a1a"/>
+          <w:rtl w:val="0"/>
+        </w:rPr>
+        <w:t xml:space="preserve">Tier 3, trivial or ephemeral input (confidence ratings, single toggles): </w:t>
+      </w:r>
+      <w:r>
+        <w:rPr>
+          <w:color w:val="1a1a1a"/>
+          <w:rtl w:val="0"/>
+        </w:rPr>
+        <w:t xml:space="preserve">silent persistence on change with live-region confirmation. No manual Save button or recovery suite.</w:t>
+      </w:r>
+    </w:p>
+    <w:p>
+      <w:pPr>
+        <w:spacing w:after="60" w:before="40" w:lineRule="auto"/>
+        <w:rPr>
+          <w:color w:val="1a1a1a"/>
+        </w:rPr>
+      </w:pPr>
+      <w:r>
+        <w:rPr>
+          <w:color w:val="1a1a1a"/>
+          <w:rtl w:val="0"/>
+        </w:rPr>
+        <w:t xml:space="preserve">Autosave SHALL be implemented as a shared module, not per-screen inline script.</w:t>
       </w:r>
     </w:p>
     <w:p>
@@ -6600,7 +6723,7 @@
           <w:szCs w:val="34"/>
           <w:rtl w:val="0"/>
         </w:rPr>
-        <w:t xml:space="preserve">Recovery Actions Required on Save Failure</w:t>
+        <w:t xml:space="preserve">Recovery Actions Required on Save Failure (Tier 1 only)</w:t>
       </w:r>
     </w:p>
     <w:p>
@@ -6762,7 +6885,7 @@
           <w:szCs w:val="34"/>
           <w:rtl w:val="0"/>
         </w:rPr>
-        <w:t xml:space="preserve">Session Restoration Options</w:t>
+        <w:t xml:space="preserve">Session Restoration Options (Tier 1 artifact/reflection screens)</w:t>
       </w:r>
     </w:p>
     <w:p>
@@ -10821,7 +10944,7 @@
                 <w:szCs w:val="16"/>
                 <w:rtl w:val="0"/>
               </w:rPr>
-              <w:t xml:space="preserve">role='dialog'</w:t>
+              <w:t xml:space="preserve">Non-modal panel (NOT role='dialog'/aria-modal; focus not trapped)</w:t>
             </w:r>
           </w:p>
           <w:p>
@@ -11037,6 +11160,30 @@
           <w:rtl w:val="0"/>
         </w:rPr>
         <w:t xml:space="preserve"> </w:t>
+      </w:r>
+    </w:p>
+    <w:p>
+      <w:pPr>
+        <w:spacing w:after="60" w:before="60" w:lineRule="auto"/>
+        <w:rPr>
+          <w:color w:val="1a1a1a"/>
+        </w:rPr>
+      </w:pPr>
+      <w:r>
+        <w:rPr>
+          <w:b w:val="1"/>
+          <w:bCs w:val="1"/>
+          <w:color w:val="1a1a1a"/>
+          <w:rtl w:val="0"/>
+        </w:rPr>
+        <w:t xml:space="preserve">Design rationale (v5.1): </w:t>
+      </w:r>
+      <w:r>
+        <w:rPr>
+          <w:color w:val="1a1a1a"/>
+          <w:rtl w:val="0"/>
+        </w:rPr>
+        <w:t xml:space="preserve">The five support panels (Artifact Reference, Decision History, Glossary, Support, Annotation) are non-modal reference panels, consulted alongside course content. Modal focus-trapping is intentionally not used, because it would prevent learners from viewing a panel alongside the content it refers to. The accessibility outcomes a modal contract protects (Escape close, focus return to trigger, single-panel-open, no focus drift to obscured content) are preserved through the behaviors above. This applies to the contracts in Sections 10 through 14.</w:t>
       </w:r>
     </w:p>
     <w:p>
@@ -14735,7 +14882,7 @@
                 <w:szCs w:val="17"/>
                 <w:rtl w:val="0"/>
               </w:rPr>
-              <w:t xml:space="preserve">Purpose, Instructions, Success Criteria, Expected Evidence.</w:t>
+              <w:t xml:space="preserve">Purpose, Instructions, Success Criteria, Expected Evidence. All four are always visible (static), not collapsible. Success Criteria is an H2-headed static card; Expected Evidence is a static context block.</w:t>
             </w:r>
           </w:p>
         </w:tc>

</xml_diff>

<commit_message>
Amend accessibility spec to v5.2: reconcile spec to as-built design (breadcrumb tracker, native radios/selects, inline compare-to-expert, progressive disclosure); defer Decision History (skip-link set 5->4, all references marked deferred)
Co-Authored-By: Claude Opus 4.8 (1M context) <noreply@anthropic.com>
</commit_message>
<xml_diff>
--- a/Docs/Accessibility & Inclusion Plan.docx
+++ b/Docs/Accessibility & Inclusion Plan.docx
@@ -75,7 +75,7 @@
           <w:color w:val="666666"/>
           <w:rtl w:val="0"/>
         </w:rPr>
-        <w:t xml:space="preserve">Version 5.1  |  Final Build, QA, and Deployment Standard  |  AccessPoint Output</w:t>
+        <w:t xml:space="preserve">Version 5.2  |  Final Build, QA, and Deployment Standard  |  AccessPoint Output</w:t>
       </w:r>
     </w:p>
     <w:p>
@@ -95,6 +95,25 @@
           <w:rtl w:val="0"/>
         </w:rPr>
         <w:t xml:space="preserve">v5.1 changelog (2026-06-27): Support panels redefined as non-modal reference panels (Sections 3 and 10). Save and recovery contract tiered by input type (Section 6); this tiering is PROVISIONAL, pending spec-owner confirmation. Guided Practice success criteria and expected evidence updated to always-visible, not collapsible (Section 15).</w:t>
+      </w:r>
+    </w:p>
+    <w:p>
+      <w:pPr>
+        <w:spacing w:before="80" w:lineRule="auto"/>
+        <w:rPr>
+          <w:i w:val="1"/>
+          <w:iCs w:val="1"/>
+          <w:color w:val="666666"/>
+        </w:rPr>
+      </w:pPr>
+      <w:r>
+        <w:rPr>
+          <w:i w:val="1"/>
+          <w:iCs w:val="1"/>
+          <w:color w:val="666666"/>
+          <w:rtl w:val="0"/>
+        </w:rPr>
+        <w:t xml:space="preserve">v5.2 changelog (2026-06-27): Reconciliation pass aligned the spec to the as-built design. Progress tracker is a breadcrumb readout, not a stepper (Sections 3, 5, 9). Decision Matrix uses native radios, not a mobile accordion (Section 14). Worked Example uses gradual-release progressive disclosure, not a Show/Hide Annotations toggle (Section 15). Sorting uses native selects, not keyboard-drag (Section 16). Compare-to-Expert is inline always-linear (Section 12). Decision History is DEFERRED: removed from the build (premature empty shell), so the required skip-link set is 5 to 4 and Decision History references are deferred until a later module re-introduces it (Sections 0, 2, 4, 8, 10, 11, 16, 17, 23, 25). Overarching principle: the build favors native, inherently accessible primitives over custom interactive widgets.</w:t>
       </w:r>
     </w:p>
     <w:p>
@@ -544,7 +563,7 @@
           <w:color w:val="1a1a1a"/>
           <w:rtl w:val="0"/>
         </w:rPr>
-        <w:t xml:space="preserve">Decision History Panel</w:t>
+        <w:t xml:space="preserve">Decision History Panel (DEFERRED v5.2)</w:t>
       </w:r>
     </w:p>
     <w:p>
@@ -733,7 +752,7 @@
                 <w:color w:val="1a1a1a"/>
                 <w:rtl w:val="0"/>
               </w:rPr>
-              <w:t xml:space="preserve">activeSupportPanel -- Allowed values: null, artifactDrawer, decisionHistory, glossary, supportPanel, annotationPanel. Opening any panel sets activeSupportPanel to that panel's value and closes all others. This state variable must be planned alongside learnerCommitmentNote, learner progress persistence, save-state persistence, and artifact status persistence.</w:t>
+              <w:t xml:space="preserve">activeSupportPanel -- Allowed values: null, artifactDrawer, glossary, supportPanel, annotationPanel. Opening any panel sets activeSupportPanel to that panel's value and closes all others. This state variable must be planned alongside learnerCommitmentNote, learner progress persistence, save-state persistence, and artifact status persistence.</w:t>
             </w:r>
           </w:p>
         </w:tc>
@@ -3163,7 +3182,7 @@
                 <w:szCs w:val="17"/>
                 <w:rtl w:val="0"/>
               </w:rPr>
-              <w:t xml:space="preserve">role='complementary' -- artifact drawer, decision history, glossary</w:t>
+              <w:t xml:space="preserve">role='complementary' -- artifact drawer, glossary</w:t>
             </w:r>
           </w:p>
         </w:tc>
@@ -3408,37 +3427,6 @@
           <w:rtl w:val="0"/>
         </w:rPr>
         <w:t xml:space="preserve">Skip to Artifact Reference</w:t>
-      </w:r>
-    </w:p>
-    <w:p>
-      <w:pPr>
-        <w:spacing w:after="40" w:before="40" w:lineRule="auto"/>
-        <w:ind w:left="720" w:firstLine="0"/>
-        <w:rPr>
-          <w:color w:val="1a1a1a"/>
-        </w:rPr>
-      </w:pPr>
-      <w:r>
-        <w:rPr>
-          <w:rtl w:val="0"/>
-        </w:rPr>
-        <w:t xml:space="preserve">•</w:t>
-      </w:r>
-      <w:r>
-        <w:rPr>
-          <w:rFonts w:ascii="Times New Roman" w:cs="Times New Roman" w:eastAsia="Times New Roman" w:hAnsi="Times New Roman"/>
-          <w:sz w:val="14"/>
-          <w:szCs w:val="14"/>
-          <w:rtl w:val="0"/>
-        </w:rPr>
-        <w:t xml:space="preserve">       </w:t>
-      </w:r>
-      <w:r>
-        <w:rPr>
-          <w:color w:val="1a1a1a"/>
-          <w:rtl w:val="0"/>
-        </w:rPr>
-        <w:t xml:space="preserve">Skip to Decision History</w:t>
       </w:r>
     </w:p>
     <w:p>
@@ -3998,7 +3986,7 @@
                 <w:szCs w:val="17"/>
                 <w:rtl w:val="0"/>
               </w:rPr>
-              <w:t xml:space="preserve">aria-current='step'</w:t>
+              <w:t xml:space="preserve">Breadcrumb: programmatic current-position labeling on role='group'</w:t>
             </w:r>
           </w:p>
         </w:tc>
@@ -4034,7 +4022,7 @@
                 <w:szCs w:val="17"/>
                 <w:rtl w:val="0"/>
               </w:rPr>
-              <w:t xml:space="preserve">Current step only</w:t>
+              <w:t xml:space="preserve">Header breadcrumb (aria-current applies to the hub map, not the header)</w:t>
             </w:r>
           </w:p>
         </w:tc>
@@ -5073,7 +5061,7 @@
           <w:color w:val="1a1a1a"/>
           <w:rtl w:val="0"/>
         </w:rPr>
-        <w:t xml:space="preserve">Decision History Panel</w:t>
+        <w:t xml:space="preserve">Decision History Panel (DEFERRED v5.2)</w:t>
       </w:r>
     </w:p>
     <w:p>
@@ -5642,7 +5630,7 @@
                 <w:szCs w:val="17"/>
                 <w:rtl w:val="0"/>
               </w:rPr>
-              <w:t xml:space="preserve">Highlighted, aria-current='step'</w:t>
+              <w:t xml:space="preserve">Highlighted current position (breadcrumb)</w:t>
             </w:r>
           </w:p>
         </w:tc>
@@ -8971,164 +8959,6 @@
                 <w:rtl w:val="0"/>
               </w:rPr>
               <w:t xml:space="preserve">"Returned to course content."</w:t>
-            </w:r>
-          </w:p>
-        </w:tc>
-      </w:tr>
-      <w:tr>
-        <w:trPr>
-          <w:cantSplit w:val="0"/>
-          <w:trHeight w:val="375" w:hRule="atLeast"/>
-          <w:tblHeader w:val="0"/>
-        </w:trPr>
-        <w:tc>
-          <w:tcPr>
-            <w:tcBorders>
-              <w:top w:color="000000" w:space="0" w:sz="0" w:val="nil"/>
-              <w:left w:color="dddddd" w:space="0" w:sz="6" w:val="single"/>
-              <w:bottom w:color="dddddd" w:space="0" w:sz="6" w:val="single"/>
-              <w:right w:color="dddddd" w:space="0" w:sz="6" w:val="single"/>
-            </w:tcBorders>
-            <w:shd w:fill="f5f5f5" w:val="clear"/>
-            <w:tcMar>
-              <w:top w:w="80.0" w:type="dxa"/>
-              <w:left w:w="100.0" w:type="dxa"/>
-              <w:bottom w:w="80.0" w:type="dxa"/>
-              <w:right w:w="100.0" w:type="dxa"/>
-            </w:tcMar>
-            <w:vAlign w:val="top"/>
-          </w:tcPr>
-          <w:p>
-            <w:pPr>
-              <w:rPr>
-                <w:color w:val="1a1a1a"/>
-                <w:sz w:val="17"/>
-                <w:szCs w:val="17"/>
-              </w:rPr>
-            </w:pPr>
-            <w:r>
-              <w:rPr>
-                <w:color w:val="1a1a1a"/>
-                <w:sz w:val="17"/>
-                <w:szCs w:val="17"/>
-                <w:rtl w:val="0"/>
-              </w:rPr>
-              <w:t xml:space="preserve">Decision History Opened</w:t>
-            </w:r>
-          </w:p>
-        </w:tc>
-        <w:tc>
-          <w:tcPr>
-            <w:tcBorders>
-              <w:top w:color="000000" w:space="0" w:sz="0" w:val="nil"/>
-              <w:left w:color="000000" w:space="0" w:sz="0" w:val="nil"/>
-              <w:bottom w:color="dddddd" w:space="0" w:sz="6" w:val="single"/>
-              <w:right w:color="dddddd" w:space="0" w:sz="6" w:val="single"/>
-            </w:tcBorders>
-            <w:shd w:fill="f5f5f5" w:val="clear"/>
-            <w:tcMar>
-              <w:top w:w="80.0" w:type="dxa"/>
-              <w:left w:w="100.0" w:type="dxa"/>
-              <w:bottom w:w="80.0" w:type="dxa"/>
-              <w:right w:w="100.0" w:type="dxa"/>
-            </w:tcMar>
-            <w:vAlign w:val="top"/>
-          </w:tcPr>
-          <w:p>
-            <w:pPr>
-              <w:rPr>
-                <w:color w:val="1a1a1a"/>
-                <w:sz w:val="17"/>
-                <w:szCs w:val="17"/>
-              </w:rPr>
-            </w:pPr>
-            <w:r>
-              <w:rPr>
-                <w:color w:val="1a1a1a"/>
-                <w:sz w:val="17"/>
-                <w:szCs w:val="17"/>
-                <w:rtl w:val="0"/>
-              </w:rPr>
-              <w:t xml:space="preserve">"Decision history opened."</w:t>
-            </w:r>
-          </w:p>
-        </w:tc>
-      </w:tr>
-      <w:tr>
-        <w:trPr>
-          <w:cantSplit w:val="0"/>
-          <w:trHeight w:val="375" w:hRule="atLeast"/>
-          <w:tblHeader w:val="0"/>
-        </w:trPr>
-        <w:tc>
-          <w:tcPr>
-            <w:tcBorders>
-              <w:top w:color="000000" w:space="0" w:sz="0" w:val="nil"/>
-              <w:left w:color="dddddd" w:space="0" w:sz="6" w:val="single"/>
-              <w:bottom w:color="dddddd" w:space="0" w:sz="6" w:val="single"/>
-              <w:right w:color="dddddd" w:space="0" w:sz="6" w:val="single"/>
-            </w:tcBorders>
-            <w:shd w:fill="ffffff" w:val="clear"/>
-            <w:tcMar>
-              <w:top w:w="80.0" w:type="dxa"/>
-              <w:left w:w="100.0" w:type="dxa"/>
-              <w:bottom w:w="80.0" w:type="dxa"/>
-              <w:right w:w="100.0" w:type="dxa"/>
-            </w:tcMar>
-            <w:vAlign w:val="top"/>
-          </w:tcPr>
-          <w:p>
-            <w:pPr>
-              <w:rPr>
-                <w:color w:val="1a1a1a"/>
-                <w:sz w:val="17"/>
-                <w:szCs w:val="17"/>
-              </w:rPr>
-            </w:pPr>
-            <w:r>
-              <w:rPr>
-                <w:color w:val="1a1a1a"/>
-                <w:sz w:val="17"/>
-                <w:szCs w:val="17"/>
-                <w:rtl w:val="0"/>
-              </w:rPr>
-              <w:t xml:space="preserve">Decision History Closed</w:t>
-            </w:r>
-          </w:p>
-        </w:tc>
-        <w:tc>
-          <w:tcPr>
-            <w:tcBorders>
-              <w:top w:color="000000" w:space="0" w:sz="0" w:val="nil"/>
-              <w:left w:color="000000" w:space="0" w:sz="0" w:val="nil"/>
-              <w:bottom w:color="dddddd" w:space="0" w:sz="6" w:val="single"/>
-              <w:right w:color="dddddd" w:space="0" w:sz="6" w:val="single"/>
-            </w:tcBorders>
-            <w:shd w:fill="ffffff" w:val="clear"/>
-            <w:tcMar>
-              <w:top w:w="80.0" w:type="dxa"/>
-              <w:left w:w="100.0" w:type="dxa"/>
-              <w:bottom w:w="80.0" w:type="dxa"/>
-              <w:right w:w="100.0" w:type="dxa"/>
-            </w:tcMar>
-            <w:vAlign w:val="top"/>
-          </w:tcPr>
-          <w:p>
-            <w:pPr>
-              <w:rPr>
-                <w:color w:val="1a1a1a"/>
-                <w:sz w:val="17"/>
-                <w:szCs w:val="17"/>
-              </w:rPr>
-            </w:pPr>
-            <w:r>
-              <w:rPr>
-                <w:color w:val="1a1a1a"/>
-                <w:sz w:val="17"/>
-                <w:szCs w:val="17"/>
-                <w:rtl w:val="0"/>
-              </w:rPr>
-              <w:t xml:space="preserve">"Decision history closed."</w:t>
             </w:r>
           </w:p>
         </w:tc>
@@ -10102,7 +9932,7 @@
                 <w:szCs w:val="16"/>
                 <w:rtl w:val="0"/>
               </w:rPr>
-              <w:t xml:space="preserve">aria-current='step'</w:t>
+              <w:t xml:space="preserve">Breadcrumb current-position labeling (not aria-current='step')</w:t>
             </w:r>
           </w:p>
           <w:p>
@@ -11183,7 +11013,7 @@
           <w:color w:val="1a1a1a"/>
           <w:rtl w:val="0"/>
         </w:rPr>
-        <w:t xml:space="preserve">The five support panels (Artifact Reference, Decision History, Glossary, Support, Annotation) are non-modal reference panels, consulted alongside course content. Modal focus-trapping is intentionally not used, because it would prevent learners from viewing a panel alongside the content it refers to. The accessibility outcomes a modal contract protects (Escape close, focus return to trigger, single-panel-open, no focus drift to obscured content) are preserved through the behaviors above. This applies to the contracts in Sections 10 through 14.</w:t>
+        <w:t xml:space="preserve">The four support panels (Artifact Reference, Glossary, Support, Annotation) are non-modal reference panels, consulted alongside course content. Modal focus-trapping is intentionally not used, because it would prevent learners from viewing a panel alongside the content it refers to. The accessibility outcomes a modal contract protects (Escape close, focus return to trigger, single-panel-open, no focus drift to obscured content) are preserved through the behaviors above. This applies to the contracts in Sections 10 through 14.</w:t>
       </w:r>
     </w:p>
     <w:p>
@@ -11210,6 +11040,25 @@
           <w:rtl w:val="0"/>
         </w:rPr>
         <w:t xml:space="preserve">Section 11: Component Contract -- Decision History Panel</w:t>
+      </w:r>
+    </w:p>
+    <w:p>
+      <w:pPr>
+        <w:spacing w:after="60" w:before="60" w:lineRule="auto"/>
+        <w:rPr>
+          <w:b w:val="1"/>
+          <w:bCs w:val="1"/>
+          <w:color w:val="1a1a1a"/>
+        </w:rPr>
+      </w:pPr>
+      <w:r>
+        <w:rPr>
+          <w:b w:val="1"/>
+          <w:bCs w:val="1"/>
+          <w:color w:val="1a1a1a"/>
+          <w:rtl w:val="0"/>
+        </w:rPr>
+        <w:t xml:space="preserve">DEFERRED (v5.2): Decision History has been removed from the build as a premature empty shell and is NOT a current requirement. The contract below is retained as the specification for re-introduction in a later module that commits to Decision History. Until then it is not required, not in the skip-link set, and not in the active support-panel set. The built (dormant, unwired) implementation is preserved in SRC/js for re-wiring.</w:t>
       </w:r>
     </w:p>
     <w:p>
@@ -14390,7 +14239,7 @@
                 <w:szCs w:val="16"/>
                 <w:rtl w:val="0"/>
               </w:rPr>
-              <w:t xml:space="preserve">Mobile accordion version</w:t>
+              <w:t xml:space="preserve">Native radio list (reflows responsively; mobile accordion not required)</w:t>
             </w:r>
           </w:p>
           <w:p>
@@ -14803,7 +14652,7 @@
                 <w:szCs w:val="17"/>
                 <w:rtl w:val="0"/>
               </w:rPr>
-              <w:t xml:space="preserve">Desktop: Content + Annotation Panel. Mobile: Content then Annotation Panel. Show/Hide Annotations toggle required.</w:t>
+              <w:t xml:space="preserve">Desktop: Content + Annotation Panel. Mobile: Content then Annotation Panel. Annotations shown via gradual-release progressive disclosure (tiered Show Expert Reasoning); a blanket Show/Hide Annotations toggle is not required.</w:t>
             </w:r>
           </w:p>
         </w:tc>
@@ -15854,7 +15703,7 @@
                 <w:szCs w:val="17"/>
                 <w:rtl w:val="0"/>
               </w:rPr>
-              <w:t xml:space="preserve">Space=Select, Arrows=Move, Space=Drop, Escape=Cancel</w:t>
+              <w:t xml:space="preserve">Sorting/assignment uses native selects (inherently keyboard/SR/switch accessible); keyboard-drag semantics not required</w:t>
             </w:r>
           </w:p>
         </w:tc>
@@ -16005,7 +15854,7 @@
                 <w:szCs w:val="17"/>
                 <w:rtl w:val="0"/>
               </w:rPr>
-              <w:t xml:space="preserve">Tab nodes, Enter source, Enter target, Delete removes</w:t>
+              <w:t xml:space="preserve">Build with native selects/primitives, not drag (per the sorting precedent): Tab nodes, Enter source, Enter target, Delete removes</w:t>
             </w:r>
           </w:p>
         </w:tc>
@@ -17062,7 +16911,7 @@
                 <w:szCs w:val="17"/>
                 <w:rtl w:val="0"/>
               </w:rPr>
-              <w:t xml:space="preserve">Tab to search, Arrow to navigate items, Enter to open</w:t>
+              <w:t xml:space="preserve">DEFERRED v5.2 (Decision History removed from build). Tab to search, Arrow to navigate items, Enter to open</w:t>
             </w:r>
           </w:p>
         </w:tc>
@@ -17475,7 +17324,7 @@
           <w:color w:val="1a1a1a"/>
           <w:rtl w:val="0"/>
         </w:rPr>
-        <w:t xml:space="preserve">Never require recall of information available through Artifact Drawer, Decision History, Progress Tracker, or Current Artifact Status</w:t>
+        <w:t xml:space="preserve">Never require recall of information available through Artifact Drawer, Progress Tracker, or Current Artifact Status</w:t>
       </w:r>
     </w:p>
     <w:p>
@@ -21756,7 +21605,7 @@
                 <w:szCs w:val="17"/>
                 <w:rtl w:val="0"/>
               </w:rPr>
-              <w:t xml:space="preserve">Decision History Panel</w:t>
+              <w:t xml:space="preserve">Decision History Panel (DEFERRED v5.2)</w:t>
             </w:r>
           </w:p>
         </w:tc>
@@ -24908,7 +24757,7 @@
                 <w:szCs w:val="17"/>
                 <w:rtl w:val="0"/>
               </w:rPr>
-              <w:t xml:space="preserve">Searchable decision history</w:t>
+              <w:t xml:space="preserve">Searchable decision history (DEFERRED v5.2)</w:t>
             </w:r>
           </w:p>
         </w:tc>

</xml_diff>